<commit_message>
Updating documents and website
The documents have been updated, where "Interaction with a partner" has been added, and the "partners" website page has been added.
</commit_message>
<xml_diff>
--- a/reports/practice_report_template.docx
+++ b/reports/practice_report_template.docx
@@ -1224,17 +1224,7 @@
           <w:szCs w:val="28"/>
           <w:lang w:eastAsia="en-US" w:bidi="en-US"/>
         </w:rPr>
-        <w:t xml:space="preserve">: </w:t>
-      </w:r>
-      <w:r>
-        <w:rPr>
-          <w:rFonts w:ascii="Times New Roman" w:eastAsia="Times New Roman" w:hAnsi="Times New Roman" w:cs="Times New Roman"/>
-          <w:color w:val="000000"/>
-          <w:sz w:val="28"/>
-          <w:szCs w:val="28"/>
-          <w:lang w:eastAsia="en-US" w:bidi="en-US"/>
-        </w:rPr>
-        <w:t>«</w:t>
+        <w:t>: «</w:t>
       </w:r>
       <w:r>
         <w:rPr>
@@ -1425,17 +1415,7 @@
           <w:szCs w:val="28"/>
           <w:lang w:eastAsia="en-US" w:bidi="en-US"/>
         </w:rPr>
-        <w:t xml:space="preserve">Наименование заказчика: </w:t>
-      </w:r>
-      <w:r>
-        <w:rPr>
-          <w:rFonts w:ascii="Times New Roman" w:eastAsia="Times New Roman" w:hAnsi="Times New Roman" w:cs="Times New Roman"/>
-          <w:color w:val="000000"/>
-          <w:sz w:val="28"/>
-          <w:szCs w:val="28"/>
-          <w:lang w:eastAsia="en-US" w:bidi="en-US"/>
-        </w:rPr>
-        <w:t>«</w:t>
+        <w:t>Наименование заказчика: «</w:t>
       </w:r>
       <w:r>
         <w:rPr>
@@ -2870,8 +2850,18 @@
           <w:rFonts w:ascii="Times New Roman" w:hAnsi="Times New Roman" w:cs="Times New Roman"/>
           <w:sz w:val="28"/>
           <w:szCs w:val="28"/>
-        </w:rPr>
-        <w:t xml:space="preserve">MDN Web </w:t>
+          <w:lang w:val="en-US"/>
+        </w:rPr>
+        <w:t xml:space="preserve">MDN Web Docs. </w:t>
+      </w:r>
+      <w:r>
+        <w:rPr>
+          <w:rFonts w:ascii="Times New Roman" w:hAnsi="Times New Roman" w:cs="Times New Roman"/>
+          <w:sz w:val="28"/>
+          <w:szCs w:val="28"/>
+          <w:lang w:val="en-US"/>
+        </w:rPr>
+        <w:t xml:space="preserve">HTML: </w:t>
       </w:r>
       <w:proofErr w:type="spellStart"/>
       <w:r>
@@ -2879,8 +2869,9 @@
           <w:rFonts w:ascii="Times New Roman" w:hAnsi="Times New Roman" w:cs="Times New Roman"/>
           <w:sz w:val="28"/>
           <w:szCs w:val="28"/>
-        </w:rPr>
-        <w:t>Docs</w:t>
+          <w:lang w:val="en-US"/>
+        </w:rPr>
+        <w:t>HyperText</w:t>
       </w:r>
       <w:proofErr w:type="spellEnd"/>
       <w:r>
@@ -2888,46 +2879,9 @@
           <w:rFonts w:ascii="Times New Roman" w:hAnsi="Times New Roman" w:cs="Times New Roman"/>
           <w:sz w:val="28"/>
           <w:szCs w:val="28"/>
-        </w:rPr>
-        <w:t xml:space="preserve">. </w:t>
-      </w:r>
-      <w:r>
-        <w:rPr>
-          <w:rFonts w:ascii="Times New Roman" w:hAnsi="Times New Roman" w:cs="Times New Roman"/>
-          <w:sz w:val="28"/>
-          <w:szCs w:val="28"/>
           <w:lang w:val="en-US"/>
         </w:rPr>
-        <w:t xml:space="preserve">HTML: </w:t>
-      </w:r>
-      <w:proofErr w:type="spellStart"/>
-      <w:r>
-        <w:rPr>
-          <w:rFonts w:ascii="Times New Roman" w:hAnsi="Times New Roman" w:cs="Times New Roman"/>
-          <w:sz w:val="28"/>
-          <w:szCs w:val="28"/>
-          <w:lang w:val="en-US"/>
-        </w:rPr>
-        <w:t>HyperText</w:t>
-      </w:r>
-      <w:proofErr w:type="spellEnd"/>
-      <w:r>
-        <w:rPr>
-          <w:rFonts w:ascii="Times New Roman" w:hAnsi="Times New Roman" w:cs="Times New Roman"/>
-          <w:sz w:val="28"/>
-          <w:szCs w:val="28"/>
-          <w:lang w:val="en-US"/>
-        </w:rPr>
-        <w:t xml:space="preserve"> Markup Language.</w:t>
-      </w:r>
-      <w:r>
-        <w:rPr>
-          <w:rFonts w:ascii="Times New Roman" w:hAnsi="Times New Roman" w:cs="Times New Roman"/>
-          <w:sz w:val="28"/>
-          <w:szCs w:val="28"/>
-          <w:lang w:val="en-US"/>
-        </w:rPr>
-        <w:t xml:space="preserve"> </w:t>
+        <w:t xml:space="preserve"> Markup Language. </w:t>
       </w:r>
       <w:hyperlink r:id="rId8" w:tgtFrame="_new" w:history="1">
         <w:r>
@@ -2970,26 +2924,9 @@
           <w:rFonts w:ascii="Times New Roman" w:hAnsi="Times New Roman" w:cs="Times New Roman"/>
           <w:sz w:val="28"/>
           <w:szCs w:val="28"/>
-        </w:rPr>
-        <w:t xml:space="preserve">MDN Web </w:t>
-      </w:r>
-      <w:proofErr w:type="spellStart"/>
-      <w:r>
-        <w:rPr>
-          <w:rFonts w:ascii="Times New Roman" w:hAnsi="Times New Roman" w:cs="Times New Roman"/>
-          <w:sz w:val="28"/>
-          <w:szCs w:val="28"/>
-        </w:rPr>
-        <w:t>Docs</w:t>
-      </w:r>
-      <w:proofErr w:type="spellEnd"/>
-      <w:r>
-        <w:rPr>
-          <w:rFonts w:ascii="Times New Roman" w:hAnsi="Times New Roman" w:cs="Times New Roman"/>
-          <w:sz w:val="28"/>
-          <w:szCs w:val="28"/>
-        </w:rPr>
-        <w:t xml:space="preserve">. </w:t>
+          <w:lang w:val="en-US"/>
+        </w:rPr>
+        <w:t xml:space="preserve">MDN Web Docs. </w:t>
       </w:r>
       <w:r>
         <w:rPr>
@@ -3168,15 +3105,7 @@
           <w:sz w:val="28"/>
           <w:szCs w:val="28"/>
         </w:rPr>
-        <w:t>Документация</w:t>
-      </w:r>
-      <w:r>
-        <w:rPr>
-          <w:rFonts w:ascii="Times New Roman" w:hAnsi="Times New Roman" w:cs="Times New Roman"/>
-          <w:sz w:val="28"/>
-          <w:szCs w:val="28"/>
-        </w:rPr>
-        <w:t xml:space="preserve"> </w:t>
+        <w:t xml:space="preserve">Документация </w:t>
       </w:r>
       <w:proofErr w:type="spellStart"/>
       <w:r>
@@ -3287,6 +3216,9 @@
     </w:p>
     <w:p>
       <w:r>
+        <w:rPr>
+          <w:noProof/>
+        </w:rPr>
         <w:drawing>
           <wp:inline distT="0" distB="0" distL="0" distR="0" wp14:anchorId="3459C5AC" wp14:editId="49638EAD">
             <wp:extent cx="2626284" cy="3857625"/>
@@ -3324,6 +3256,9 @@
         </w:drawing>
       </w:r>
       <w:r>
+        <w:rPr>
+          <w:noProof/>
+        </w:rPr>
         <w:drawing>
           <wp:inline distT="0" distB="0" distL="0" distR="0" wp14:anchorId="58BD3A94" wp14:editId="2B672DCC">
             <wp:extent cx="2714625" cy="3913910"/>
@@ -3363,6 +3298,7 @@
       <w:r>
         <w:rPr>
           <w:rFonts w:ascii="Times New Roman" w:eastAsia="Times New Roman" w:hAnsi="Times New Roman" w:cs="Times New Roman"/>
+          <w:noProof/>
           <w:color w:val="000000"/>
           <w:sz w:val="28"/>
           <w:szCs w:val="28"/>
@@ -3410,6 +3346,9 @@
         <w:t xml:space="preserve"> </w:t>
       </w:r>
       <w:r>
+        <w:rPr>
+          <w:noProof/>
+        </w:rPr>
         <w:drawing>
           <wp:inline distT="0" distB="0" distL="0" distR="0" wp14:anchorId="5EA25F3E" wp14:editId="6F02FB5F">
             <wp:extent cx="2171700" cy="3348038"/>
@@ -3461,14 +3400,23 @@
           <w:sz w:val="28"/>
           <w:szCs w:val="28"/>
         </w:rPr>
-        <w:t xml:space="preserve">Схема проекта: </w:t>
-      </w:r>
-      <w:r>
+        <w:t>Схема проекта:</w:t>
+      </w:r>
+    </w:p>
+    <w:p>
+      <w:pPr>
         <w:rPr>
           <w:rFonts w:ascii="Times New Roman" w:hAnsi="Times New Roman" w:cs="Times New Roman"/>
           <w:sz w:val="28"/>
           <w:szCs w:val="28"/>
         </w:rPr>
+      </w:pPr>
+      <w:r>
+        <w:rPr>
+          <w:rFonts w:ascii="Times New Roman" w:hAnsi="Times New Roman" w:cs="Times New Roman"/>
+          <w:sz w:val="28"/>
+          <w:szCs w:val="28"/>
+        </w:rPr>
         <w:t xml:space="preserve">Пользователь → </w:t>
       </w:r>
       <w:r>
@@ -3489,8 +3437,159 @@
         <w:t>-бот → задания → обучение → результат</w:t>
       </w:r>
     </w:p>
+    <w:p>
+      <w:pPr>
+        <w:rPr>
+          <w:rFonts w:ascii="Times New Roman" w:hAnsi="Times New Roman" w:cs="Times New Roman"/>
+          <w:sz w:val="28"/>
+          <w:szCs w:val="28"/>
+        </w:rPr>
+      </w:pPr>
+      <w:r>
+        <w:rPr>
+          <w:rFonts w:ascii="Times New Roman" w:hAnsi="Times New Roman" w:cs="Times New Roman"/>
+          <w:sz w:val="28"/>
+          <w:szCs w:val="28"/>
+        </w:rPr>
+        <w:br w:type="page"/>
+      </w:r>
+    </w:p>
+    <w:p>
+      <w:pPr>
+        <w:rPr>
+          <w:rFonts w:ascii="Times New Roman" w:hAnsi="Times New Roman" w:cs="Times New Roman"/>
+          <w:sz w:val="28"/>
+          <w:szCs w:val="28"/>
+          <w:lang w:val="en-US"/>
+        </w:rPr>
+      </w:pPr>
+      <w:r>
+        <w:rPr>
+          <w:rFonts w:ascii="Times New Roman" w:hAnsi="Times New Roman" w:cs="Times New Roman"/>
+          <w:sz w:val="28"/>
+          <w:szCs w:val="28"/>
+        </w:rPr>
+        <w:lastRenderedPageBreak/>
+        <w:t>Взаимодействие с организацией-партнёром</w:t>
+      </w:r>
+      <w:r>
+        <w:rPr>
+          <w:rFonts w:ascii="Times New Roman" w:hAnsi="Times New Roman" w:cs="Times New Roman"/>
+          <w:sz w:val="28"/>
+          <w:szCs w:val="28"/>
+          <w:lang w:val="en-US"/>
+        </w:rPr>
+        <w:t>:</w:t>
+      </w:r>
+    </w:p>
+    <w:p>
+      <w:pPr>
+        <w:rPr>
+          <w:rFonts w:ascii="Times New Roman" w:hAnsi="Times New Roman" w:cs="Times New Roman"/>
+          <w:sz w:val="28"/>
+          <w:szCs w:val="28"/>
+          <w:lang w:val="en-US"/>
+        </w:rPr>
+      </w:pPr>
+      <w:r>
+        <w:rPr>
+          <w:rFonts w:ascii="Times New Roman" w:hAnsi="Times New Roman" w:cs="Times New Roman"/>
+          <w:sz w:val="28"/>
+          <w:szCs w:val="28"/>
+          <w:lang w:val="en-US"/>
+        </w:rPr>
+        <w:drawing>
+          <wp:inline distT="0" distB="0" distL="0" distR="0" wp14:anchorId="67ACE725" wp14:editId="7288CE79">
+            <wp:extent cx="5210175" cy="3916296"/>
+            <wp:effectExtent l="0" t="0" r="0" b="8255"/>
+            <wp:docPr id="7" name="Рисунок 7"/>
+            <wp:cNvGraphicFramePr>
+              <a:graphicFrameLocks xmlns:a="http://schemas.openxmlformats.org/drawingml/2006/main" noChangeAspect="1"/>
+            </wp:cNvGraphicFramePr>
+            <a:graphic xmlns:a="http://schemas.openxmlformats.org/drawingml/2006/main">
+              <a:graphicData uri="http://schemas.openxmlformats.org/drawingml/2006/picture">
+                <pic:pic xmlns:pic="http://schemas.openxmlformats.org/drawingml/2006/picture">
+                  <pic:nvPicPr>
+                    <pic:cNvPr id="1" name=""/>
+                    <pic:cNvPicPr/>
+                  </pic:nvPicPr>
+                  <pic:blipFill>
+                    <a:blip r:embed="rId18"/>
+                    <a:stretch>
+                      <a:fillRect/>
+                    </a:stretch>
+                  </pic:blipFill>
+                  <pic:spPr>
+                    <a:xfrm>
+                      <a:off x="0" y="0"/>
+                      <a:ext cx="5216567" cy="3921100"/>
+                    </a:xfrm>
+                    <a:prstGeom prst="rect">
+                      <a:avLst/>
+                    </a:prstGeom>
+                  </pic:spPr>
+                </pic:pic>
+              </a:graphicData>
+            </a:graphic>
+          </wp:inline>
+        </w:drawing>
+      </w:r>
+    </w:p>
+    <w:p>
+      <w:pPr>
+        <w:rPr>
+          <w:rFonts w:ascii="Times New Roman" w:hAnsi="Times New Roman" w:cs="Times New Roman"/>
+          <w:sz w:val="28"/>
+          <w:szCs w:val="28"/>
+          <w:lang w:val="en-US"/>
+        </w:rPr>
+      </w:pPr>
+      <w:r>
+        <w:rPr>
+          <w:rFonts w:ascii="Times New Roman" w:hAnsi="Times New Roman" w:cs="Times New Roman"/>
+          <w:sz w:val="28"/>
+          <w:szCs w:val="28"/>
+          <w:lang w:val="en-US"/>
+        </w:rPr>
+        <w:drawing>
+          <wp:inline distT="0" distB="0" distL="0" distR="0" wp14:anchorId="75FFA277" wp14:editId="37043090">
+            <wp:extent cx="5227077" cy="3914775"/>
+            <wp:effectExtent l="0" t="0" r="0" b="0"/>
+            <wp:docPr id="8" name="Рисунок 8"/>
+            <wp:cNvGraphicFramePr>
+              <a:graphicFrameLocks xmlns:a="http://schemas.openxmlformats.org/drawingml/2006/main" noChangeAspect="1"/>
+            </wp:cNvGraphicFramePr>
+            <a:graphic xmlns:a="http://schemas.openxmlformats.org/drawingml/2006/main">
+              <a:graphicData uri="http://schemas.openxmlformats.org/drawingml/2006/picture">
+                <pic:pic xmlns:pic="http://schemas.openxmlformats.org/drawingml/2006/picture">
+                  <pic:nvPicPr>
+                    <pic:cNvPr id="1" name=""/>
+                    <pic:cNvPicPr/>
+                  </pic:nvPicPr>
+                  <pic:blipFill>
+                    <a:blip r:embed="rId19"/>
+                    <a:stretch>
+                      <a:fillRect/>
+                    </a:stretch>
+                  </pic:blipFill>
+                  <pic:spPr>
+                    <a:xfrm>
+                      <a:off x="0" y="0"/>
+                      <a:ext cx="5235738" cy="3921261"/>
+                    </a:xfrm>
+                    <a:prstGeom prst="rect">
+                      <a:avLst/>
+                    </a:prstGeom>
+                  </pic:spPr>
+                </pic:pic>
+              </a:graphicData>
+            </a:graphic>
+          </wp:inline>
+        </w:drawing>
+      </w:r>
+    </w:p>
     <w:sectPr>
-      <w:footerReference w:type="default" r:id="rId18"/>
+      <w:footerReference w:type="default" r:id="rId20"/>
       <w:pgSz w:w="11906" w:h="16838"/>
       <w:pgMar w:top="1134" w:right="850" w:bottom="1134" w:left="1134" w:header="708" w:footer="708" w:gutter="0"/>
       <w:pgNumType w:start="1"/>
@@ -7291,6 +7390,7 @@
     <w:lsdException w:name="HTML Sample" w:semiHidden="1" w:unhideWhenUsed="1"/>
     <w:lsdException w:name="HTML Typewriter" w:semiHidden="1" w:unhideWhenUsed="1"/>
     <w:lsdException w:name="HTML Variable" w:semiHidden="1" w:unhideWhenUsed="1"/>
+    <w:lsdException w:name="Normal Table" w:semiHidden="1" w:unhideWhenUsed="1"/>
     <w:lsdException w:name="annotation subject" w:semiHidden="1" w:unhideWhenUsed="1"/>
     <w:lsdException w:name="No List" w:semiHidden="1" w:unhideWhenUsed="1"/>
     <w:lsdException w:name="Outline List 1" w:semiHidden="1" w:unhideWhenUsed="1"/>
@@ -7333,8 +7433,11 @@
     <w:lsdException w:name="Table Contemporary" w:semiHidden="1" w:unhideWhenUsed="1"/>
     <w:lsdException w:name="Table Elegant" w:semiHidden="1" w:unhideWhenUsed="1"/>
     <w:lsdException w:name="Table Professional" w:semiHidden="1" w:unhideWhenUsed="1"/>
+    <w:lsdException w:name="Table Subtle 1" w:semiHidden="1" w:unhideWhenUsed="1"/>
     <w:lsdException w:name="Table Subtle 2" w:semiHidden="1" w:unhideWhenUsed="1"/>
     <w:lsdException w:name="Table Web 1" w:semiHidden="1" w:unhideWhenUsed="1"/>
+    <w:lsdException w:name="Table Web 2" w:semiHidden="1" w:unhideWhenUsed="1"/>
+    <w:lsdException w:name="Table Web 3" w:semiHidden="1" w:unhideWhenUsed="1"/>
     <w:lsdException w:name="Balloon Text" w:semiHidden="1" w:unhideWhenUsed="1"/>
     <w:lsdException w:name="Table Grid" w:uiPriority="39"/>
     <w:lsdException w:name="Table Theme" w:semiHidden="1" w:unhideWhenUsed="1"/>

</xml_diff>